<commit_message>
feat: refactor pandoc format assistant
</commit_message>
<xml_diff>
--- a/templates/academic.docx
+++ b/templates/academic.docx
@@ -7,6 +7,10 @@
         <w:pStyle w:val="ListNumber"/>
       </w:pPr>
       <w:r>
+        <w:rPr>
+          <w:rFonts w:ascii="Times New Roman" w:hAnsi="Times New Roman" w:cs="Times New Roman" w:eastAsia="宋体"/>
+          <w:color w:val="000000"/>
+        </w:rPr>
         <w:t>编号项 1</w:t>
       </w:r>
     </w:p>
@@ -15,6 +19,10 @@
         <w:pStyle w:val="ListNumber"/>
       </w:pPr>
       <w:r>
+        <w:rPr>
+          <w:rFonts w:ascii="Times New Roman" w:hAnsi="Times New Roman" w:cs="Times New Roman" w:eastAsia="宋体"/>
+          <w:color w:val="000000"/>
+        </w:rPr>
         <w:t>编号项 2</w:t>
       </w:r>
     </w:p>
@@ -23,6 +31,10 @@
         <w:pStyle w:val="ListNumber"/>
       </w:pPr>
       <w:r>
+        <w:rPr>
+          <w:rFonts w:ascii="Times New Roman" w:hAnsi="Times New Roman" w:cs="Times New Roman" w:eastAsia="宋体"/>
+          <w:color w:val="000000"/>
+        </w:rPr>
         <w:t>编号项 3</w:t>
       </w:r>
     </w:p>
@@ -31,6 +43,10 @@
         <w:pStyle w:val="ListBullet"/>
       </w:pPr>
       <w:r>
+        <w:rPr>
+          <w:rFonts w:ascii="Times New Roman" w:hAnsi="Times New Roman" w:cs="Times New Roman" w:eastAsia="宋体"/>
+          <w:color w:val="000000"/>
+        </w:rPr>
         <w:t>要点项 1</w:t>
       </w:r>
     </w:p>
@@ -39,6 +55,10 @@
         <w:pStyle w:val="ListBullet"/>
       </w:pPr>
       <w:r>
+        <w:rPr>
+          <w:rFonts w:ascii="Times New Roman" w:hAnsi="Times New Roman" w:cs="Times New Roman" w:eastAsia="宋体"/>
+          <w:color w:val="000000"/>
+        </w:rPr>
         <w:t>要点项 2</w:t>
       </w:r>
     </w:p>
@@ -47,10 +67,16 @@
         <w:pStyle w:val="ListBullet"/>
       </w:pPr>
       <w:r>
+        <w:rPr>
+          <w:rFonts w:ascii="Times New Roman" w:hAnsi="Times New Roman" w:cs="Times New Roman" w:eastAsia="宋体"/>
+          <w:color w:val="000000"/>
+        </w:rPr>
         <w:t>要点项 3</w:t>
       </w:r>
     </w:p>
     <w:sectPr>
+      <w:headerReference w:type="default" r:id="rId9"/>
+      <w:footerReference w:type="default" r:id="rId10"/>
       <w:pgSz w:w="11906" w:h="16838"/>
       <w:pgMar w:top="1440" w:right="1797" w:bottom="1440" w:left="1797" w:header="720" w:footer="720" w:gutter="0"/>
       <w:cols w:space="720"/>
@@ -58,6 +84,26 @@
     </w:sectPr>
   </w:body>
 </w:document>
+</file>
+
+<file path=word/footer1.xml><?xml version="1.0" encoding="utf-8"?>
+<w:ftr xmlns:m="http://schemas.openxmlformats.org/officeDocument/2006/math" xmlns:mc="http://schemas.openxmlformats.org/markup-compatibility/2006" xmlns:mo="http://schemas.microsoft.com/office/mac/office/2008/main" xmlns:mv="urn:schemas-microsoft-com:mac:vml" xmlns:o="urn:schemas-microsoft-com:office:office" xmlns:r="http://schemas.openxmlformats.org/officeDocument/2006/relationships" xmlns:v="urn:schemas-microsoft-com:vml" xmlns:w10="urn:schemas-microsoft-com:office:word" xmlns:w14="http://schemas.microsoft.com/office/word/2010/wordml" xmlns:w="http://schemas.openxmlformats.org/wordprocessingml/2006/main" xmlns:wne="http://schemas.microsoft.com/office/word/2006/wordml" xmlns:wp14="http://schemas.microsoft.com/office/word/2010/wordprocessingDrawing" xmlns:wp="http://schemas.openxmlformats.org/drawingml/2006/wordprocessingDrawing" xmlns:wpc="http://schemas.microsoft.com/office/word/2010/wordprocessingCanvas" xmlns:wpg="http://schemas.microsoft.com/office/word/2010/wordprocessingGroup" xmlns:wpi="http://schemas.microsoft.com/office/word/2010/wordprocessingInk" xmlns:wps="http://schemas.microsoft.com/office/word/2010/wordprocessingShape" mc:Ignorable="w14 wp14">
+  <w:p>
+    <w:pPr>
+      <w:pStyle w:val="Footer"/>
+    </w:pPr>
+  </w:p>
+</w:ftr>
+</file>
+
+<file path=word/header1.xml><?xml version="1.0" encoding="utf-8"?>
+<w:hdr xmlns:m="http://schemas.openxmlformats.org/officeDocument/2006/math" xmlns:mc="http://schemas.openxmlformats.org/markup-compatibility/2006" xmlns:mo="http://schemas.microsoft.com/office/mac/office/2008/main" xmlns:mv="urn:schemas-microsoft-com:mac:vml" xmlns:o="urn:schemas-microsoft-com:office:office" xmlns:r="http://schemas.openxmlformats.org/officeDocument/2006/relationships" xmlns:v="urn:schemas-microsoft-com:vml" xmlns:w10="urn:schemas-microsoft-com:office:word" xmlns:w14="http://schemas.microsoft.com/office/word/2010/wordml" xmlns:w="http://schemas.openxmlformats.org/wordprocessingml/2006/main" xmlns:wne="http://schemas.microsoft.com/office/word/2006/wordml" xmlns:wp14="http://schemas.microsoft.com/office/word/2010/wordprocessingDrawing" xmlns:wp="http://schemas.openxmlformats.org/drawingml/2006/wordprocessingDrawing" xmlns:wpc="http://schemas.microsoft.com/office/word/2010/wordprocessingCanvas" xmlns:wpg="http://schemas.microsoft.com/office/word/2010/wordprocessingGroup" xmlns:wpi="http://schemas.microsoft.com/office/word/2010/wordprocessingInk" xmlns:wps="http://schemas.microsoft.com/office/word/2010/wordprocessingShape" mc:Ignorable="w14 wp14">
+  <w:p>
+    <w:pPr>
+      <w:pStyle w:val="Header"/>
+    </w:pPr>
+  </w:p>
+</w:hdr>
 </file>
 
 <file path=word/numbering.xml><?xml version="1.0" encoding="utf-8"?>
@@ -428,7 +474,8 @@
       <w:ind w:firstLine="480"/>
     </w:pPr>
     <w:rPr>
-      <w:rFonts w:ascii="Times New Roman" w:hAnsi="Times New Roman" w:eastAsia="宋体"/>
+      <w:rFonts w:ascii="Times New Roman" w:hAnsi="Times New Roman" w:eastAsia="宋体" w:cs="Times New Roman"/>
+      <w:color w:val="000000"/>
       <w:sz w:val="24"/>
     </w:rPr>
   </w:style>
@@ -493,10 +540,10 @@
       <w:outlineLvl w:val="0"/>
     </w:pPr>
     <w:rPr>
-      <w:rFonts w:asciiTheme="majorHAnsi" w:eastAsiaTheme="majorEastAsia" w:hAnsiTheme="majorHAnsi" w:cstheme="majorBidi" w:ascii="Times New Roman" w:hAnsi="Times New Roman" w:eastAsia="黑体"/>
+      <w:rFonts w:ascii="Times New Roman" w:hAnsi="Times New Roman" w:eastAsia="宋体" w:cs="Times New Roman"/>
       <w:b/>
       <w:bCs/>
-      <w:color w:val="365F91" w:themeColor="accent1" w:themeShade="BF"/>
+      <w:color w:val="000000"/>
       <w:sz w:val="32"/>
       <w:szCs w:val="28"/>
     </w:rPr>
@@ -518,10 +565,10 @@
       <w:outlineLvl w:val="1"/>
     </w:pPr>
     <w:rPr>
-      <w:rFonts w:asciiTheme="majorHAnsi" w:eastAsiaTheme="majorEastAsia" w:hAnsiTheme="majorHAnsi" w:cstheme="majorBidi" w:ascii="Times New Roman" w:hAnsi="Times New Roman" w:eastAsia="黑体"/>
+      <w:rFonts w:ascii="Times New Roman" w:hAnsi="Times New Roman" w:eastAsia="宋体" w:cs="Times New Roman"/>
       <w:b/>
       <w:bCs/>
-      <w:color w:val="4F81BD" w:themeColor="accent1"/>
+      <w:color w:val="000000"/>
       <w:sz w:val="28"/>
       <w:szCs w:val="26"/>
     </w:rPr>
@@ -543,10 +590,10 @@
       <w:outlineLvl w:val="2"/>
     </w:pPr>
     <w:rPr>
-      <w:rFonts w:asciiTheme="majorHAnsi" w:eastAsiaTheme="majorEastAsia" w:hAnsiTheme="majorHAnsi" w:cstheme="majorBidi" w:ascii="Times New Roman" w:hAnsi="Times New Roman" w:eastAsia="黑体"/>
+      <w:rFonts w:ascii="Times New Roman" w:hAnsi="Times New Roman" w:eastAsia="宋体" w:cs="Times New Roman"/>
       <w:b/>
       <w:bCs/>
-      <w:color w:val="4F81BD" w:themeColor="accent1"/>
+      <w:color w:val="000000"/>
       <w:sz w:val="24"/>
     </w:rPr>
   </w:style>
@@ -567,12 +614,12 @@
       <w:outlineLvl w:val="3"/>
     </w:pPr>
     <w:rPr>
-      <w:rFonts w:asciiTheme="majorHAnsi" w:eastAsiaTheme="majorEastAsia" w:hAnsiTheme="majorHAnsi" w:cstheme="majorBidi"/>
+      <w:rFonts w:ascii="Times New Roman" w:hAnsi="Times New Roman" w:cs="Times New Roman" w:eastAsia="宋体"/>
       <w:b/>
       <w:bCs/>
       <w:i/>
       <w:iCs/>
-      <w:color w:val="4F81BD" w:themeColor="accent1"/>
+      <w:color w:val="000000"/>
     </w:rPr>
   </w:style>
   <w:style w:type="paragraph" w:styleId="Heading5">
@@ -592,8 +639,8 @@
       <w:outlineLvl w:val="4"/>
     </w:pPr>
     <w:rPr>
-      <w:rFonts w:asciiTheme="majorHAnsi" w:eastAsiaTheme="majorEastAsia" w:hAnsiTheme="majorHAnsi" w:cstheme="majorBidi"/>
-      <w:color w:val="243F60" w:themeColor="accent1" w:themeShade="7F"/>
+      <w:rFonts w:ascii="Times New Roman" w:hAnsi="Times New Roman" w:cs="Times New Roman" w:eastAsia="宋体"/>
+      <w:color w:val="000000"/>
     </w:rPr>
   </w:style>
   <w:style w:type="paragraph" w:styleId="Heading6">
@@ -613,10 +660,10 @@
       <w:outlineLvl w:val="5"/>
     </w:pPr>
     <w:rPr>
-      <w:rFonts w:asciiTheme="majorHAnsi" w:eastAsiaTheme="majorEastAsia" w:hAnsiTheme="majorHAnsi" w:cstheme="majorBidi"/>
+      <w:rFonts w:ascii="Times New Roman" w:hAnsi="Times New Roman" w:cs="Times New Roman" w:eastAsia="宋体"/>
       <w:i/>
       <w:iCs/>
-      <w:color w:val="243F60" w:themeColor="accent1" w:themeShade="7F"/>
+      <w:color w:val="000000"/>
     </w:rPr>
   </w:style>
   <w:style w:type="paragraph" w:styleId="Heading7">
@@ -636,10 +683,10 @@
       <w:outlineLvl w:val="6"/>
     </w:pPr>
     <w:rPr>
-      <w:rFonts w:asciiTheme="majorHAnsi" w:eastAsiaTheme="majorEastAsia" w:hAnsiTheme="majorHAnsi" w:cstheme="majorBidi"/>
+      <w:rFonts w:ascii="Times New Roman" w:hAnsi="Times New Roman" w:cs="Times New Roman" w:eastAsia="宋体"/>
       <w:i/>
       <w:iCs/>
-      <w:color w:val="404040" w:themeColor="text1" w:themeTint="BF"/>
+      <w:color w:val="000000"/>
     </w:rPr>
   </w:style>
   <w:style w:type="paragraph" w:styleId="Heading8">
@@ -659,8 +706,8 @@
       <w:outlineLvl w:val="7"/>
     </w:pPr>
     <w:rPr>
-      <w:rFonts w:asciiTheme="majorHAnsi" w:eastAsiaTheme="majorEastAsia" w:hAnsiTheme="majorHAnsi" w:cstheme="majorBidi"/>
-      <w:color w:val="4F81BD" w:themeColor="accent1"/>
+      <w:rFonts w:ascii="Times New Roman" w:hAnsi="Times New Roman" w:cs="Times New Roman" w:eastAsia="宋体"/>
+      <w:color w:val="000000"/>
       <w:sz w:val="20"/>
       <w:szCs w:val="20"/>
     </w:rPr>
@@ -682,10 +729,10 @@
       <w:outlineLvl w:val="8"/>
     </w:pPr>
     <w:rPr>
-      <w:rFonts w:asciiTheme="majorHAnsi" w:eastAsiaTheme="majorEastAsia" w:hAnsiTheme="majorHAnsi" w:cstheme="majorBidi"/>
+      <w:rFonts w:ascii="Times New Roman" w:hAnsi="Times New Roman" w:cs="Times New Roman" w:eastAsia="宋体"/>
       <w:i/>
       <w:iCs/>
-      <w:color w:val="404040" w:themeColor="text1" w:themeTint="BF"/>
+      <w:color w:val="000000"/>
       <w:sz w:val="20"/>
       <w:szCs w:val="20"/>
     </w:rPr>
@@ -733,10 +780,10 @@
     <w:uiPriority w:val="9"/>
     <w:rsid w:val="00FC693F"/>
     <w:rPr>
-      <w:rFonts w:asciiTheme="majorHAnsi" w:eastAsiaTheme="majorEastAsia" w:hAnsiTheme="majorHAnsi" w:cstheme="majorBidi"/>
+      <w:rFonts w:ascii="Times New Roman" w:hAnsi="Times New Roman" w:cs="Times New Roman" w:eastAsia="宋体"/>
       <w:b/>
       <w:bCs/>
-      <w:color w:val="365F91" w:themeColor="accent1" w:themeShade="BF"/>
+      <w:color w:val="000000"/>
       <w:sz w:val="28"/>
       <w:szCs w:val="28"/>
     </w:rPr>
@@ -748,10 +795,10 @@
     <w:uiPriority w:val="9"/>
     <w:rsid w:val="00FC693F"/>
     <w:rPr>
-      <w:rFonts w:asciiTheme="majorHAnsi" w:eastAsiaTheme="majorEastAsia" w:hAnsiTheme="majorHAnsi" w:cstheme="majorBidi"/>
+      <w:rFonts w:ascii="Times New Roman" w:hAnsi="Times New Roman" w:cs="Times New Roman" w:eastAsia="宋体"/>
       <w:b/>
       <w:bCs/>
-      <w:color w:val="4F81BD" w:themeColor="accent1"/>
+      <w:color w:val="000000"/>
       <w:sz w:val="26"/>
       <w:szCs w:val="26"/>
     </w:rPr>
@@ -763,10 +810,10 @@
     <w:uiPriority w:val="9"/>
     <w:rsid w:val="00FC693F"/>
     <w:rPr>
-      <w:rFonts w:asciiTheme="majorHAnsi" w:eastAsiaTheme="majorEastAsia" w:hAnsiTheme="majorHAnsi" w:cstheme="majorBidi"/>
+      <w:rFonts w:ascii="Times New Roman" w:hAnsi="Times New Roman" w:cs="Times New Roman" w:eastAsia="宋体"/>
       <w:b/>
       <w:bCs/>
-      <w:color w:val="4F81BD" w:themeColor="accent1"/>
+      <w:color w:val="000000"/>
     </w:rPr>
   </w:style>
   <w:style w:type="paragraph" w:styleId="Title">
@@ -785,8 +832,8 @@
       <w:contextualSpacing/>
     </w:pPr>
     <w:rPr>
-      <w:rFonts w:asciiTheme="majorHAnsi" w:eastAsiaTheme="majorEastAsia" w:hAnsiTheme="majorHAnsi" w:cstheme="majorBidi"/>
-      <w:color w:val="17365D" w:themeColor="text2" w:themeShade="BF"/>
+      <w:rFonts w:ascii="Times New Roman" w:hAnsi="Times New Roman" w:cs="Times New Roman" w:eastAsia="宋体"/>
+      <w:color w:val="000000"/>
       <w:spacing w:val="5"/>
       <w:kern w:val="28"/>
       <w:sz w:val="52"/>
@@ -822,10 +869,10 @@
       </w:numPr>
     </w:pPr>
     <w:rPr>
-      <w:rFonts w:asciiTheme="majorHAnsi" w:eastAsiaTheme="majorEastAsia" w:hAnsiTheme="majorHAnsi" w:cstheme="majorBidi"/>
+      <w:rFonts w:ascii="Times New Roman" w:hAnsi="Times New Roman" w:cs="Times New Roman" w:eastAsia="宋体"/>
       <w:i/>
       <w:iCs/>
-      <w:color w:val="4F81BD" w:themeColor="accent1"/>
+      <w:color w:val="000000"/>
       <w:spacing w:val="15"/>
       <w:sz w:val="24"/>
       <w:szCs w:val="24"/>
@@ -857,6 +904,10 @@
       <w:ind w:left="720"/>
       <w:contextualSpacing/>
     </w:pPr>
+    <w:rPr>
+      <w:rFonts w:ascii="Times New Roman" w:hAnsi="Times New Roman" w:cs="Times New Roman" w:eastAsia="宋体"/>
+      <w:color w:val="000000"/>
+    </w:rPr>
   </w:style>
   <w:style w:type="paragraph" w:styleId="BodyText">
     <w:name w:val="Body Text"/>
@@ -868,6 +919,10 @@
     <w:pPr>
       <w:spacing w:after="120"/>
     </w:pPr>
+    <w:rPr>
+      <w:rFonts w:ascii="Times New Roman" w:hAnsi="Times New Roman" w:cs="Times New Roman" w:eastAsia="宋体"/>
+      <w:color w:val="000000"/>
+    </w:rPr>
   </w:style>
   <w:style w:type="character" w:customStyle="1" w:styleId="BodyTextChar">
     <w:name w:val="Body Text Char"/>
@@ -965,6 +1020,10 @@
       </w:numPr>
       <w:contextualSpacing/>
     </w:pPr>
+    <w:rPr>
+      <w:rFonts w:ascii="Times New Roman" w:hAnsi="Times New Roman" w:cs="Times New Roman" w:eastAsia="宋体"/>
+      <w:color w:val="000000"/>
+    </w:rPr>
   </w:style>
   <w:style w:type="paragraph" w:styleId="ListBullet2">
     <w:name w:val="List Bullet 2"/>
@@ -978,6 +1037,10 @@
       </w:numPr>
       <w:contextualSpacing/>
     </w:pPr>
+    <w:rPr>
+      <w:rFonts w:ascii="Times New Roman" w:hAnsi="Times New Roman" w:cs="Times New Roman" w:eastAsia="宋体"/>
+      <w:color w:val="000000"/>
+    </w:rPr>
   </w:style>
   <w:style w:type="paragraph" w:styleId="ListBullet3">
     <w:name w:val="List Bullet 3"/>
@@ -991,6 +1054,10 @@
       </w:numPr>
       <w:contextualSpacing/>
     </w:pPr>
+    <w:rPr>
+      <w:rFonts w:ascii="Times New Roman" w:hAnsi="Times New Roman" w:cs="Times New Roman" w:eastAsia="宋体"/>
+      <w:color w:val="000000"/>
+    </w:rPr>
   </w:style>
   <w:style w:type="paragraph" w:styleId="ListNumber">
     <w:name w:val="List Number"/>
@@ -1004,6 +1071,10 @@
       </w:numPr>
       <w:contextualSpacing/>
     </w:pPr>
+    <w:rPr>
+      <w:rFonts w:ascii="Times New Roman" w:hAnsi="Times New Roman" w:cs="Times New Roman" w:eastAsia="宋体"/>
+      <w:color w:val="000000"/>
+    </w:rPr>
   </w:style>
   <w:style w:type="paragraph" w:styleId="ListNumber2">
     <w:name w:val="List Number 2"/>
@@ -1017,6 +1088,10 @@
       </w:numPr>
       <w:contextualSpacing/>
     </w:pPr>
+    <w:rPr>
+      <w:rFonts w:ascii="Times New Roman" w:hAnsi="Times New Roman" w:cs="Times New Roman" w:eastAsia="宋体"/>
+      <w:color w:val="000000"/>
+    </w:rPr>
   </w:style>
   <w:style w:type="paragraph" w:styleId="ListNumber3">
     <w:name w:val="List Number 3"/>
@@ -1030,6 +1105,10 @@
       </w:numPr>
       <w:contextualSpacing/>
     </w:pPr>
+    <w:rPr>
+      <w:rFonts w:ascii="Times New Roman" w:hAnsi="Times New Roman" w:cs="Times New Roman" w:eastAsia="宋体"/>
+      <w:color w:val="000000"/>
+    </w:rPr>
   </w:style>
   <w:style w:type="paragraph" w:styleId="ListContinue">
     <w:name w:val="List Continue"/>
@@ -1114,9 +1193,10 @@
       <w:ind w:left="1134"/>
     </w:pPr>
     <w:rPr>
+      <w:rFonts w:ascii="Times New Roman" w:hAnsi="Times New Roman" w:cs="Times New Roman" w:eastAsia="宋体"/>
       <w:i/>
       <w:iCs/>
-      <w:color w:val="000000" w:themeColor="text1"/>
+      <w:color w:val="000000"/>
     </w:rPr>
   </w:style>
   <w:style w:type="character" w:customStyle="1" w:styleId="QuoteChar">
@@ -1139,12 +1219,12 @@
     <w:semiHidden/>
     <w:rsid w:val="00FC693F"/>
     <w:rPr>
-      <w:rFonts w:asciiTheme="majorHAnsi" w:eastAsiaTheme="majorEastAsia" w:hAnsiTheme="majorHAnsi" w:cstheme="majorBidi"/>
+      <w:rFonts w:ascii="Times New Roman" w:hAnsi="Times New Roman" w:cs="Times New Roman" w:eastAsia="宋体"/>
       <w:b/>
       <w:bCs/>
       <w:i/>
       <w:iCs/>
-      <w:color w:val="4F81BD" w:themeColor="accent1"/>
+      <w:color w:val="000000"/>
     </w:rPr>
   </w:style>
   <w:style w:type="character" w:customStyle="1" w:styleId="Heading5Char">
@@ -1155,8 +1235,8 @@
     <w:semiHidden/>
     <w:rsid w:val="00FC693F"/>
     <w:rPr>
-      <w:rFonts w:asciiTheme="majorHAnsi" w:eastAsiaTheme="majorEastAsia" w:hAnsiTheme="majorHAnsi" w:cstheme="majorBidi"/>
-      <w:color w:val="243F60" w:themeColor="accent1" w:themeShade="7F"/>
+      <w:rFonts w:ascii="Times New Roman" w:hAnsi="Times New Roman" w:cs="Times New Roman" w:eastAsia="宋体"/>
+      <w:color w:val="000000"/>
     </w:rPr>
   </w:style>
   <w:style w:type="character" w:customStyle="1" w:styleId="Heading6Char">
@@ -1167,10 +1247,10 @@
     <w:semiHidden/>
     <w:rsid w:val="00FC693F"/>
     <w:rPr>
-      <w:rFonts w:asciiTheme="majorHAnsi" w:eastAsiaTheme="majorEastAsia" w:hAnsiTheme="majorHAnsi" w:cstheme="majorBidi"/>
+      <w:rFonts w:ascii="Times New Roman" w:hAnsi="Times New Roman" w:cs="Times New Roman" w:eastAsia="宋体"/>
       <w:i/>
       <w:iCs/>
-      <w:color w:val="243F60" w:themeColor="accent1" w:themeShade="7F"/>
+      <w:color w:val="000000"/>
     </w:rPr>
   </w:style>
   <w:style w:type="character" w:customStyle="1" w:styleId="Heading7Char">
@@ -1181,10 +1261,10 @@
     <w:semiHidden/>
     <w:rsid w:val="00FC693F"/>
     <w:rPr>
-      <w:rFonts w:asciiTheme="majorHAnsi" w:eastAsiaTheme="majorEastAsia" w:hAnsiTheme="majorHAnsi" w:cstheme="majorBidi"/>
+      <w:rFonts w:ascii="Times New Roman" w:hAnsi="Times New Roman" w:cs="Times New Roman" w:eastAsia="宋体"/>
       <w:i/>
       <w:iCs/>
-      <w:color w:val="404040" w:themeColor="text1" w:themeTint="BF"/>
+      <w:color w:val="000000"/>
     </w:rPr>
   </w:style>
   <w:style w:type="character" w:customStyle="1" w:styleId="Heading8Char">
@@ -1195,8 +1275,8 @@
     <w:semiHidden/>
     <w:rsid w:val="00FC693F"/>
     <w:rPr>
-      <w:rFonts w:asciiTheme="majorHAnsi" w:eastAsiaTheme="majorEastAsia" w:hAnsiTheme="majorHAnsi" w:cstheme="majorBidi"/>
-      <w:color w:val="4F81BD" w:themeColor="accent1"/>
+      <w:rFonts w:ascii="Times New Roman" w:hAnsi="Times New Roman" w:cs="Times New Roman" w:eastAsia="宋体"/>
+      <w:color w:val="000000"/>
       <w:sz w:val="20"/>
       <w:szCs w:val="20"/>
     </w:rPr>
@@ -1209,10 +1289,10 @@
     <w:semiHidden/>
     <w:rsid w:val="00FC693F"/>
     <w:rPr>
-      <w:rFonts w:asciiTheme="majorHAnsi" w:eastAsiaTheme="majorEastAsia" w:hAnsiTheme="majorHAnsi" w:cstheme="majorBidi"/>
+      <w:rFonts w:ascii="Times New Roman" w:hAnsi="Times New Roman" w:cs="Times New Roman" w:eastAsia="宋体"/>
       <w:i/>
       <w:iCs/>
-      <w:color w:val="404040" w:themeColor="text1" w:themeTint="BF"/>
+      <w:color w:val="000000"/>
       <w:sz w:val="20"/>
       <w:szCs w:val="20"/>
     </w:rPr>
@@ -1230,9 +1310,10 @@
       <w:spacing w:line="240" w:lineRule="auto"/>
     </w:pPr>
     <w:rPr>
+      <w:rFonts w:ascii="Times New Roman" w:hAnsi="Times New Roman" w:cs="Times New Roman" w:eastAsia="宋体"/>
       <w:b/>
       <w:bCs/>
-      <w:color w:val="4F81BD" w:themeColor="accent1"/>
+      <w:color w:val="000000"/>
       <w:sz w:val="18"/>
       <w:szCs w:val="18"/>
     </w:rPr>
@@ -12125,7 +12206,14 @@
   <w:style w:type="character" w:customStyle="1" w:styleId="Code">
     <w:name w:val="Code"/>
     <w:rPr>
-      <w:rFonts w:ascii="Consolas" w:hAnsi="Consolas"/>
+      <w:rFonts w:ascii="Consolas" w:hAnsi="Consolas" w:eastAsia="Consolas"/>
+      <w:sz w:val="20"/>
+    </w:rPr>
+  </w:style>
+  <w:style w:type="character" w:customStyle="1" w:styleId="SourceCode">
+    <w:name w:val="Source Code"/>
+    <w:rPr>
+      <w:rFonts w:ascii="Consolas" w:hAnsi="Consolas" w:eastAsia="Consolas"/>
       <w:sz w:val="20"/>
     </w:rPr>
   </w:style>

</xml_diff>